<commit_message>
docs: fix week 8 legal costs, shares, voting and IP details in report, agreement and slides
</commit_message>
<xml_diff>
--- a/READMEs/sem_7/week8/attachments/Партнёрское_соглашение_PiConstruct.docx
+++ b/READMEs/sem_7/week8/attachments/Партнёрское_соглашение_PiConstruct.docx
@@ -305,7 +305,7 @@
           <w:szCs w:val="24"/>
           <w:rFonts w:ascii="Times New Roman" w:cs="Times New Roman" w:eastAsia="Times New Roman" w:hAnsi="Times New Roman"/>
         </w:rPr>
-        <w:t xml:space="preserve">Участники намерены учредить общество с ограниченной ответственностью (далее — «Компания») на условиях раздела 2 настоящего соглашения. До учреждения Компании отношения Участников регулируются настоящим соглашением как договором о совместной деятельности (простом товариществе).</w:t>
+        <w:t>Участники намерены учредить общество с ограниченной ответственностью (далее — «Компания») на условиях раздела 2 настоящего соглашения. До учреждения Компании отношения Участников регулируются настоящим соглашением как договором, не предусмотренным законом (п. 2 ст. 421 ГК РФ). Соглашение не является договором простого товарищества: сторонами такого договора для предпринимательской деятельности могут быть только индивидуальные предприниматели и коммерческие организации (п. 2 ст. 1041 ГК РФ).</w:t>
       </w:r>
     </w:p>
     <w:p>
@@ -404,7 +404,7 @@
           <w:szCs w:val="24"/>
           <w:rFonts w:ascii="Times New Roman" w:cs="Times New Roman" w:eastAsia="Times New Roman" w:hAnsi="Times New Roman"/>
         </w:rPr>
-        <w:t xml:space="preserve">Доли Участников в Компании устанавливаются равными — по 20% уставного капитала каждому Участнику. Обоснование равных долей: роли Участников комплементарны, каждая зона ответственности закреплена за одним человеком и не дублируется; справедливость равенства во времени обеспечивается Вестингом.</w:t>
+        <w:t>Доли Участников в Компании устанавливаются с учётом вклада, загрузки (п. 2.1) и рисков каждого Участника: Участник 1 — ___%; Участник 2 — ___%; Участник 3 — ___%; Участник 4 — ___%; Участник 5 — ___% уставного капитала. Значения согласуются Участниками до подписания настоящего соглашения; закрепление долей во времени обеспечивается Вестингом.</w:t>
       </w:r>
     </w:p>
     <w:p>
@@ -431,7 +431,7 @@
           <w:szCs w:val="24"/>
           <w:rFonts w:ascii="Times New Roman" w:cs="Times New Roman" w:eastAsia="Times New Roman" w:hAnsi="Times New Roman"/>
         </w:rPr>
-        <w:t xml:space="preserve">Уставный капитал Компании — 50 000 (пятьдесят тысяч) рублей, вносится деньгами: по 10 000 (десять тысяч) рублей с каждого Участника.</w:t>
+        <w:t>Уставный капитал Компании — 10 000 (десять тысяч) рублей, вносится деньгами каждым Участником пропорционально его доле.</w:t>
       </w:r>
     </w:p>
     <w:p>
@@ -458,7 +458,7 @@
           <w:szCs w:val="24"/>
           <w:rFonts w:ascii="Times New Roman" w:cs="Times New Roman" w:eastAsia="Times New Roman" w:hAnsi="Times New Roman"/>
         </w:rPr>
-        <w:t xml:space="preserve">До учреждения Компании доли в настоящем соглашении определяют порядок распределения прибыли, голосования и взаимных прав Участников; юридическую силу в отношении третьих лиц они приобретают с момента регистрации Компании.</w:t>
+        <w:t>До учреждения Компании доли в настоящем соглашении определяют порядок распределения прибыли и взаимных прав Участников (порядок голосования — раздел 5); юридическую силу в отношении третьих лиц они приобретают с момента регистрации Компании.</w:t>
       </w:r>
     </w:p>
     <w:p>
@@ -530,7 +530,7 @@
           <w:szCs w:val="24"/>
           <w:rFonts w:ascii="Times New Roman" w:cs="Times New Roman" w:eastAsia="Times New Roman" w:hAnsi="Times New Roman"/>
         </w:rPr>
-        <w:t xml:space="preserve">Генеральным директором Компании назначается Участник 1 (Савельев С.). Действия без отдельного решения Участников: сделки на сумму до 100 000 (ста тысяч) рублей; приём текущих операционных решений в пределах бюджета.</w:t>
+        <w:t>Полномочия единоличного исполнительного органа Компании по решению общего собрания передаются управляющему — индивидуальному предпринимателю Участнику 1 (Савельев С.) по договору с Компанией (ст. 42 Федерального закона «Об обществах с ограниченной ответственностью»). Действия без отдельного решения Участников: сделки на сумму до 100 000 (ста тысяч) рублей; приём текущих операционных решений в пределах бюджета.</w:t>
       </w:r>
     </w:p>
     <w:p>
@@ -728,7 +728,7 @@
           <w:szCs w:val="24"/>
           <w:rFonts w:ascii="Times New Roman" w:cs="Times New Roman" w:eastAsia="Times New Roman" w:hAnsi="Times New Roman"/>
         </w:rPr>
-        <w:t xml:space="preserve">Решения принимаются голосованием Участников; каждый Участник имеет один голос, пропорционально доле не голосуют. Кворум — все пять Участников; мнение выражается очно, в видеоконференции или письменно.</w:t>
+        <w:t>До учреждения Компании каждый Участник имеет один голос; после учреждения Участники голосуют пропорционально своим долям (ст. 32 Федерального закона «Об обществах с ограниченной ответственностью»). Кворум — все пять Участников; мнение выражается очно, в видеоконференции или письменно.</w:t>
       </w:r>
     </w:p>
     <w:p>
@@ -755,7 +755,7 @@
           <w:szCs w:val="24"/>
           <w:rFonts w:ascii="Times New Roman" w:cs="Times New Roman" w:eastAsia="Times New Roman" w:hAnsi="Times New Roman"/>
         </w:rPr>
-        <w:t xml:space="preserve">Текущие решения (операционный план, бюджет до 500 000 рублей в квартал, найм исполнителей, ценообразование в рамках утверждённой стратегии) принимаются большинством голосов — не менее 3 из 5.</w:t>
+        <w:t>Текущие решения (операционный план, бюджет до 500 000 рублей в квартал, найм исполнителей, ценообразование в рамках утверждённой стратегии) принимаются большинством: до учреждения Компании — не менее 3 из 5 голосов, после учреждения — более половины голосов Участников.</w:t>
       </w:r>
     </w:p>
     <w:p>
@@ -782,7 +782,7 @@
           <w:szCs w:val="24"/>
           <w:rFonts w:ascii="Times New Roman" w:cs="Times New Roman" w:eastAsia="Times New Roman" w:hAnsi="Times New Roman"/>
         </w:rPr>
-        <w:t xml:space="preserve">Единогласно принимаются Ключевые решения: (1) приём новых и выход действующих Участников; (2) продажа, залог долей третьим лицам; (3) ликвидация и реорганизация Компании; (4) привлечение финансирования с размыванием долей; (5) сделки на сумму свыше 500 000 (пятисот тысяч) рублей; (6) смена продуктового направления Проекта.</w:t>
+        <w:t>Ключевые решения принимаются квалифицированным большинством — до учреждения Компании не менее 4 из 5 голосов, после учреждения не менее 3/4 голосов Участников: (1) приём новых и выход действующих Участников; (2) продажа, залог долей третьим лицам; (3) привлечение финансирования с размыванием долей; (4) сделки на сумму свыше 500 000 (пятисот тысяч) рублей; (5) смена продуктового направления Проекта. Решения о реорганизации и ликвидации Компании принимаются всеми Участниками единогласно (ст. 37 Федерального закона «Об обществах с ограниченной ответственностью»).</w:t>
       </w:r>
     </w:p>
     <w:p>
@@ -881,7 +881,7 @@
           <w:szCs w:val="24"/>
           <w:rFonts w:ascii="Times New Roman" w:cs="Times New Roman" w:eastAsia="Times New Roman" w:hAnsi="Times New Roman"/>
         </w:rPr>
-        <w:t xml:space="preserve">Ограничение конкуренции действует 12 (двенадцать) месяцев после прекращения участия в Проекте в отношении ниши, указанной в п. 6.1.</w:t>
+        <w:t>После прекращения участия в Проекте ограничение конкуренции не применяется; бывший Участник соблюдает конфиденциальность (п. 6.3) и не использует конфиденциальную информацию Проекта в конкурирующей деятельности.</w:t>
       </w:r>
     </w:p>
     <w:p>
@@ -1133,7 +1133,7 @@
           <w:szCs w:val="24"/>
           <w:rFonts w:ascii="Times New Roman" w:cs="Times New Roman" w:eastAsia="Times New Roman" w:hAnsi="Times New Roman"/>
         </w:rPr>
-        <w:t xml:space="preserve">Выходящий Участник передаёт дела и материалы своей зоны в течение 10 (десяти) рабочих дней с даты прекращения участия; конфиденциальность (п. 6.3) и неконкуренция (п. 6.2) сохраняются.</w:t>
+        <w:t>Выходящий Участник передаёт дела и материалы своей зоны в течение 10 (десяти) рабочих дней с даты прекращения участия; обязательства по п. 6.2 и конфиденциальность (п. 6.3) сохраняются.</w:t>
       </w:r>
     </w:p>
     <w:p>

</xml_diff>